<commit_message>
376 essay done :D
</commit_message>
<xml_diff>
--- a/376/Final essay with format.docx
+++ b/376/Final essay with format.docx
@@ -437,64 +437,283 @@
         <w:pStyle w:val="Heading1"/>
       </w:pPr>
       <w:r>
-        <w:t>Introduction (</w:t>
-      </w:r>
-      <w:r>
-        <w:rPr>
-          <w:rFonts w:eastAsia="MS Mincho"/>
-          <w:i/>
-        </w:rPr>
-        <w:t>Heading 1</w:t>
-      </w:r>
-      <w:r>
-        <w:t>)</w:t>
-      </w:r>
-    </w:p>
-    <w:p>
-      <w:pPr>
-        <w:pStyle w:val="BodyText"/>
-      </w:pPr>
-      <w:r>
-        <w:t xml:space="preserve">This template, </w:t>
-      </w:r>
-      <w:r>
-        <w:t>modified</w:t>
-      </w:r>
-      <w:r>
-        <w:t xml:space="preserve"> in MS Word 200</w:t>
-      </w:r>
-      <w:r>
-        <w:rPr>
-          <w:lang w:val="en-US"/>
-        </w:rPr>
-        <w:t>7</w:t>
-      </w:r>
-      <w:r>
-        <w:t xml:space="preserve"> and saved as </w:t>
-      </w:r>
-      <w:r>
-        <w:rPr>
-          <w:lang w:val="en-US"/>
-        </w:rPr>
-        <w:t xml:space="preserve">a </w:t>
-      </w:r>
-      <w:r>
-        <w:t>“Word 97-200</w:t>
+        <w:t>Introduction</w:t>
+      </w:r>
+    </w:p>
+    <w:p>
+      <w:pPr>
+        <w:spacing w:after="12pt"/>
+        <w:jc w:val="both"/>
+      </w:pPr>
+      <w:r>
+        <w:t>“</w:t>
+      </w:r>
+      <w:r>
+        <w:t>Addiction is a treatable, chronic medical disease involving complex interactions among brain circuits, genetics, the environment, and an individual’s life experiences. People with addiction use substances or engage in behaviors that become compulsive and often continue despite harmful consequences</w:t>
+      </w:r>
+      <w:r>
+        <w:t>” [</w:t>
+      </w:r>
+      <w:r>
+        <w:t>1</w:t>
+      </w:r>
+      <w:r>
+        <w:t>]</w:t>
+      </w:r>
+      <w:r>
+        <w:t>.</w:t>
+      </w:r>
+    </w:p>
+    <w:p>
+      <w:pPr>
+        <w:spacing w:after="12pt"/>
+        <w:jc w:val="both"/>
+      </w:pPr>
+      <w:r>
+        <w:t xml:space="preserve">Addiction is a very serious problem in lots of parts of the world. Which is why social media business models that promote addiction </w:t>
+      </w:r>
+      <w:r>
+        <w:t>are</w:t>
+      </w:r>
+      <w:r>
+        <w:t xml:space="preserve"> so worrisome. Social media’s current model is to maximize engagement [</w:t>
+      </w:r>
+      <w:r>
+        <w:t>2</w:t>
+      </w:r>
+      <w:r>
+        <w:t>]. They do this because they can sell the data gathered from their users while the user is using the product to advertisers. This is worrisome because it incentivizes social media sites to implement addictive designs to keep their users engaged and online for as long as possible.</w:t>
+      </w:r>
+      <w:r>
+        <w:t xml:space="preserve"> A business that is purely financially incentivized to addict th</w:t>
+      </w:r>
+      <w:r>
+        <w:t xml:space="preserve">eir users </w:t>
+      </w:r>
+      <w:r>
+        <w:t>is unethical and should be regulated.</w:t>
+      </w:r>
+      <w:r>
+        <w:t xml:space="preserve"> That is the </w:t>
+      </w:r>
+      <w:proofErr w:type="gramStart"/>
+      <w:r>
+        <w:t>product’s</w:t>
+      </w:r>
+      <w:proofErr w:type="gramEnd"/>
+      <w:r>
+        <w:t xml:space="preserve"> or business’ only income is from the customer or user using the product. </w:t>
+      </w:r>
+    </w:p>
+    <w:p>
+      <w:pPr>
+        <w:pStyle w:val="Heading1"/>
+      </w:pPr>
+      <w:r>
+        <w:t>What products are a problem</w:t>
+      </w:r>
+    </w:p>
+    <w:p>
+      <w:pPr>
+        <w:spacing w:after="12pt"/>
+        <w:jc w:val="both"/>
+      </w:pPr>
+      <w:r>
+        <w:t xml:space="preserve">Problematic addiction can happen from anything, but a normal business model is not purely incentivized to make their product addictive. A normal business model is making a product that people want to buy, people buy the product, end of deal. This business model incentivizes products that customers will want to buy again. That product could be addictive, but the seller would not care how much time you spend on or with the product </w:t>
+      </w:r>
+      <w:proofErr w:type="gramStart"/>
+      <w:r>
+        <w:t>as long as</w:t>
+      </w:r>
+      <w:proofErr w:type="gramEnd"/>
+      <w:r>
+        <w:t xml:space="preserve"> you buy the product. </w:t>
+      </w:r>
+    </w:p>
+    <w:p>
+      <w:pPr>
+        <w:spacing w:after="12pt"/>
+        <w:jc w:val="both"/>
+      </w:pPr>
+      <w:r>
+        <w:t>All forms of entertainment can be addictive. We enjoy something so we want to experience it more. A problem occurs when entertainment is trying to be addictive, not just as entertaining as possible. If your product is trying to provide entertainment, your goal should be to entertain thus getting your users to come back because they want to be entertained. Your goal should not be to get your users addicted and want them to spend all their time on your product, the goal is your user spends all their free time and excess money on your product or service.</w:t>
+      </w:r>
+    </w:p>
+    <w:p>
+      <w:pPr>
+        <w:pStyle w:val="Heading2"/>
+      </w:pPr>
+      <w:r>
+        <w:t>Gambling</w:t>
+      </w:r>
+    </w:p>
+    <w:p>
+      <w:pPr>
+        <w:jc w:val="both"/>
+      </w:pPr>
+      <w:r>
+        <w:t xml:space="preserve">Gambling companies are notorious for trying to keep their customers gambling for as long as possible. Las Vegas casinos are set </w:t>
+      </w:r>
+      <w:proofErr w:type="gramStart"/>
+      <w:r>
+        <w:t>up</w:t>
+      </w:r>
+      <w:proofErr w:type="gramEnd"/>
+      <w:r>
+        <w:t xml:space="preserve"> so the customer loses track of time all the while trying to keep the customer playing. They are financially incentivized to do this because on average if a customer is playing on a slot machine the casino is gaining money. This incentive perfectly incentivizes an addictive design. Luckly for casinos they don’t have to try very hard to make their product addictive. Since people are generally bad at calculating probability gambling is inherently addictive. The casinos help this alone; by not having clocks visible making it easy to lose track of time, making sure there are sounds of people winning to make it seems like you could win at any given moment and making sure you have everything you need to keep gambling, food drinks and money. Gambling is heavily regulated in most countries including Canada for the very reason that is so addictive. The point that gambling is incentivized to be addictive and that casinos implement addictive designs is one that make it </w:t>
+      </w:r>
+      <w:proofErr w:type="gramStart"/>
+      <w:r>
+        <w:t>similar to</w:t>
+      </w:r>
+      <w:proofErr w:type="gramEnd"/>
+      <w:r>
+        <w:t xml:space="preserve"> social media.</w:t>
+      </w:r>
+    </w:p>
+    <w:p>
+      <w:pPr>
+        <w:pStyle w:val="Heading2"/>
+      </w:pPr>
+      <w:r>
+        <w:t>Netflix</w:t>
+      </w:r>
+    </w:p>
+    <w:p>
+      <w:pPr>
+        <w:jc w:val="both"/>
+      </w:pPr>
+      <w:r>
+        <w:t xml:space="preserve">Netflix is a very close example of a product that uses users’ data. Unfortunately, Netflix has its own problems with addictive design; the auto play feature, incentivizing users to continue watching, is the biggest. Although, Netflix is not majorly financially incentivized to make their product addictive. </w:t>
+      </w:r>
+      <w:r>
+        <w:t>Netflix</w:t>
+      </w:r>
+      <w:r>
+        <w:t xml:space="preserve"> largest incentive is for users to keep their monthly subscription, which is far from the same thing, Netflix would be happy for you to only watch something once a month. Netflix does use user data for themselves, they curate personal suggestions using the data collected. They also have recently started an ad supported subscription plan and their terms of service leaves it open to sell users’ data to advertisers for targeted adds [</w:t>
       </w:r>
       <w:r>
         <w:t>3</w:t>
       </w:r>
       <w:r>
+        <w:t>]. Netflix revenue is not majorly supported through user data, making Netflix not incentivized to use addictive design, marking them differently that social media.</w:t>
+      </w:r>
+    </w:p>
+    <w:p>
+      <w:pPr>
+        <w:pStyle w:val="Heading2"/>
+      </w:pPr>
+      <w:r>
+        <w:t>Video Games</w:t>
+      </w:r>
+    </w:p>
+    <w:p>
+      <w:pPr>
+        <w:jc w:val="both"/>
+      </w:pPr>
+      <w:r>
+        <w:t xml:space="preserve">Video games are often accused of being addictive and they certainly can be. Depending on the monetization structure a video game has they can also be incentivized to create addictive designs. Since video games are entertainment, they are incentivized to be as entertaining as possible to keep users. The classic monetization method of buying a video game full price up front provides no incentive for developers to create addictive designs. The financial incentive can unfortunately lead to over </w:t>
+      </w:r>
+      <w:r>
+        <w:lastRenderedPageBreak/>
+        <w:t>promising and under delivering because the only goal of the developer is to get the customer to buy the game once. A subscription-based model leads to a similar scenario to Netflix, all the developers want is for you to keep paying the subscription. The downside is developers are incentivized to make a game longer to keep players playing and paying the subscription. Luckly the incentive can clash with the incentive to make an entertaining product, if developers draw out a game too much it will become less entertaining. The last common monetization method is microtransaction. Lots of games add micro transaction on top of other forms of monetization but some games only rely on microtransaction. Those that do are incentivized to make the purchases as attractive as possible as it is the game’s only source of revenue. This can play out in multiple ways. Some microtransactions give progression within a game which is not particularly aligned with addictive design. Unfortunately, some microtransactions are very similar to gambling, a player buys a random in game reward which can have differing value. This similarity to gambling comes with the same downsides of addiction. So even if the game itself doesn’t implement addictive design the microtransactions are inherently addictive. If a game solely or mostly relies on this form of monetization, then it shares the same problems as social media.</w:t>
+      </w:r>
+    </w:p>
+    <w:p>
+      <w:pPr>
+        <w:pStyle w:val="Heading2"/>
+      </w:pPr>
+      <w:r>
+        <w:t>Television</w:t>
+      </w:r>
+    </w:p>
+    <w:p>
+      <w:pPr>
+        <w:jc w:val="both"/>
+      </w:pPr>
+      <w:r>
+        <w:t>Television also has a lot of ad revenue. Luckly for television most providers are not solely incentivized by ads, they often have a subscription cost as well. This is a key difference and just like all other products that have a subscription model they are incentivized to keep users paying for the subscription. Unfortunately for television they earn a lot of money from advertising, so they are at risk of being incentivized to use addictive design. The addictive nature of television was initially worrying for people [</w:t>
+      </w:r>
+      <w:r>
+        <w:t>4</w:t>
+      </w:r>
+      <w:r>
+        <w:t xml:space="preserve">]. </w:t>
+      </w:r>
+    </w:p>
+    <w:p>
+      <w:pPr>
+        <w:pStyle w:val="Heading2"/>
+      </w:pPr>
+      <w:r>
+        <w:t>Professional Sports</w:t>
+      </w:r>
+    </w:p>
+    <w:p>
+      <w:pPr>
+        <w:jc w:val="both"/>
+      </w:pPr>
+      <w:r>
+        <w:t xml:space="preserve">Very related to television is professional sports. Professional sports are packed full of advertisements. Luckly watching professional sports is either through a television which is not incredibly addictive or in person. If you watch your sports in person you need to buy tickets, making the people that run the events incentivized to sell tickets not keep you at the stadium. There is also the problem that the athletes playing would grow tired if they were constantly </w:t>
+      </w:r>
+      <w:proofErr w:type="gramStart"/>
+      <w:r>
+        <w:t>playing</w:t>
+      </w:r>
+      <w:proofErr w:type="gramEnd"/>
+      <w:r>
+        <w:t xml:space="preserve"> making the entertainment of the sports less entertaining.</w:t>
+      </w:r>
+    </w:p>
+    <w:p>
+      <w:pPr>
+        <w:pStyle w:val="Heading2"/>
+      </w:pPr>
+      <w:r>
+        <w:t>Google</w:t>
+      </w:r>
+    </w:p>
+    <w:p>
+      <w:pPr>
+        <w:jc w:val="both"/>
+      </w:pPr>
+      <w:r>
+        <w:t xml:space="preserve">A good counter argument to the protective measures is that google makes most of its money from selling user data. Luckly </w:t>
+      </w:r>
+      <w:proofErr w:type="gramStart"/>
+      <w:r>
+        <w:t>google</w:t>
+      </w:r>
+      <w:proofErr w:type="gramEnd"/>
+      <w:r>
+        <w:t xml:space="preserve"> already has protective measures built in. When you go to look something up using google your goal is to find your answer as fast as possible. </w:t>
+      </w:r>
+      <w:proofErr w:type="gramStart"/>
+      <w:r>
+        <w:t>In order to</w:t>
+      </w:r>
+      <w:proofErr w:type="gramEnd"/>
+      <w:r>
+        <w:t xml:space="preserve"> attract and keep users Google’s largest incentive is to get the user the requested information as soon as possible. So even though Google is incentivized to keep their users on the platform for as long as possible to harvest </w:t>
+      </w:r>
+      <w:proofErr w:type="gramStart"/>
+      <w:r>
+        <w:t>there</w:t>
+      </w:r>
+      <w:proofErr w:type="gramEnd"/>
+      <w:r>
         <w:t xml:space="preserve"> </w:t>
       </w:r>
-      <w:r>
-        <w:rPr>
-          <w:lang w:val="en-US"/>
-        </w:rPr>
-        <w:t>Document</w:t>
-      </w:r>
-      <w:r>
-        <w:t>” for the PC, provides authors with most of the formatting specifications needed for preparing electronic versions of their papers. All standard paper components have been specified for three reasons: (1) ease of use when formatting individual papers, (2) automatic compliance to electronic requirements that facilitate the concurrent or later production of electronic products, and (3) conformity of style throughout a conference proceedings. Margins, column widths, line spacing, and type styles are built-in; examples of the type styles are provided throughout this document and are identified in italic type, within parentheses, following the example. Some components, such as multi-leveled equations, graphics, and tables are not prescribed, although the various table text styles are provided. The formatter will need to create these components, incorporating the applicable criteria that follow.</w:t>
+      <w:proofErr w:type="gramStart"/>
+      <w:r>
+        <w:t>data</w:t>
+      </w:r>
+      <w:proofErr w:type="gramEnd"/>
+      <w:r>
+        <w:t xml:space="preserve"> if they did it would most likely be </w:t>
+      </w:r>
+      <w:r>
+        <w:t>at the expense of a good product. This competing forces on incentives make sure google doesn’t make an addictive product.</w:t>
       </w:r>
     </w:p>
     <w:p>
@@ -502,7 +721,154 @@
         <w:pStyle w:val="Heading1"/>
       </w:pPr>
       <w:r>
-        <w:t>Ease of Use</w:t>
+        <w:t>Free will vs protection</w:t>
+      </w:r>
+    </w:p>
+    <w:p>
+      <w:pPr>
+        <w:spacing w:after="12pt"/>
+        <w:jc w:val="both"/>
+      </w:pPr>
+      <w:r>
+        <w:t>If you want to keep someone safe, you can wrap them in bubble wrap and force them to stay in the house. Unfortunately, you cannot protect this person from everything, there is always a small chance a big storm knocks over a tree and crushes the house with the person inside it. Also keeping someone as a prisoner even in their own house is in most scenarios frowned upon.</w:t>
+      </w:r>
+    </w:p>
+    <w:p>
+      <w:pPr>
+        <w:spacing w:after="12pt"/>
+        <w:jc w:val="both"/>
+      </w:pPr>
+      <w:r>
+        <w:t>In society we generally don’t restrict each other’s basic rights. The UN has a nice list of beautiful rights everyone should have [</w:t>
+      </w:r>
+      <w:r>
+        <w:t>5</w:t>
+      </w:r>
+      <w:r>
+        <w:t xml:space="preserve">]. One of which is that you are free; meaning you should be able to do what you like, harming others is of course too far, because that infringes on another’s basic rights. How much potential self-harm does something need before it should be restricted? Lots of people think that suicide is not something that should be </w:t>
+      </w:r>
+      <w:proofErr w:type="gramStart"/>
+      <w:r>
+        <w:t>allow</w:t>
+      </w:r>
+      <w:proofErr w:type="gramEnd"/>
+      <w:r>
+        <w:t>, but some countries even allow that in some cases [</w:t>
+      </w:r>
+      <w:r>
+        <w:t>6</w:t>
+      </w:r>
+      <w:r>
+        <w:t xml:space="preserve">]. But most people do not think that society should restrict sky diving, even if there is a higher </w:t>
+      </w:r>
+      <w:proofErr w:type="spellStart"/>
+      <w:r>
+        <w:t>then</w:t>
+      </w:r>
+      <w:proofErr w:type="spellEnd"/>
+      <w:r>
+        <w:t xml:space="preserve"> normal chance to harm oneself.</w:t>
+      </w:r>
+    </w:p>
+    <w:p>
+      <w:pPr>
+        <w:spacing w:after="12pt"/>
+        <w:jc w:val="both"/>
+      </w:pPr>
+      <w:r>
+        <w:t>This line becomes even more blurred when we consider drugs and alcohol. Some countries prohibit the consumption of alcohol, and some do not. Both the USA and Canada prohibited alcohol at points throughout their history [</w:t>
+      </w:r>
+      <w:r>
+        <w:t>7, 8</w:t>
+      </w:r>
+      <w:r>
+        <w:t xml:space="preserve">]. This back and forth of letting people do something that might hurt them without restricting a </w:t>
+      </w:r>
+      <w:proofErr w:type="gramStart"/>
+      <w:r>
+        <w:t>person</w:t>
+      </w:r>
+      <w:proofErr w:type="gramEnd"/>
+      <w:r>
+        <w:t xml:space="preserve"> basic right of free will is prevalent in lots of discussions. Should hard drugs be illegal to use? Should tobacco be illegal? Should gambling be illegal? Should marijuana be illegal?</w:t>
+      </w:r>
+    </w:p>
+    <w:p>
+      <w:pPr>
+        <w:spacing w:after="12pt"/>
+        <w:jc w:val="both"/>
+      </w:pPr>
+      <w:r>
+        <w:t>These arguments of free will vs protecting people change significantly when the people that are being protected are minor. The answer to all the above questions, should x be illegal, were yes if you are a minor in Canada. Minors don’t have fully developed frontal lobes, the part of the brain the regulates decision making [</w:t>
+      </w:r>
+      <w:r>
+        <w:t>9</w:t>
+      </w:r>
+      <w:r>
+        <w:t>]. For this reason, drugs and other addictive products are often illegal for children to use. All these products are also very addictive. The dugs, tobacco, alcohol, marijuana are all chemically addictive. Your body can crave the feeling that is felt while using these drugs. Letting minors become addicted to these drugs before they can fully think through the potential consequence of that addiction is largely frowned upon and is another reason these drugs are illegal for minors in Canada. Gambling is also illegal for minors in Canada because of the potential to become addicted.</w:t>
+      </w:r>
+    </w:p>
+    <w:p>
+      <w:pPr>
+        <w:spacing w:after="12pt"/>
+        <w:jc w:val="both"/>
+      </w:pPr>
+      <w:r>
+        <w:t>In Canada the laws have made it clear that we allow adults to do things that could potentially harm selves. If your act will potentially harm another, is it not ok.</w:t>
+      </w:r>
+      <w:r>
+        <w:t xml:space="preserve"> </w:t>
+      </w:r>
+      <w:r>
+        <w:t xml:space="preserve">You are allowed to be drunk, but that drunkenness cannot put others in harm’s way. It is illegal to drive drunk, because you are putting others in unnecessary danger. You are allowed to smoke tobacco, but there are now rules where you can smoke </w:t>
+      </w:r>
+      <w:proofErr w:type="gramStart"/>
+      <w:r>
+        <w:t>in order to</w:t>
+      </w:r>
+      <w:proofErr w:type="gramEnd"/>
+      <w:r>
+        <w:t xml:space="preserve"> protect </w:t>
+      </w:r>
+      <w:r>
+        <w:lastRenderedPageBreak/>
+        <w:t>those that would be harmed by secondhand smoke. You are allowed to gamble, and strangely gambling breaks the trend of being illegal if you harm others. If you lose all your money gambling there are no laws stopping you, even if you are responsible for minor.</w:t>
+      </w:r>
+    </w:p>
+    <w:p>
+      <w:pPr>
+        <w:spacing w:after="12pt"/>
+        <w:jc w:val="both"/>
+      </w:pPr>
+      <w:r>
+        <w:t>Gambling and social media are slightly different than the chemically addictive drugs. Theoretically the sellers of the drugs do not care if you use them, they only care that they have sold them, they are incentivized to sell drugs. Whereas social media is specially incentivized to make you use the product. Gambling is also in the boat. Both social media and gambling do not earn revenue what the product being used. The similarities on gambling and social media do not stop there, the trance or zone experience by gamblers is very similar to that of the zone experienced by people scrolling social media [].</w:t>
+      </w:r>
+    </w:p>
+    <w:p>
+      <w:pPr>
+        <w:spacing w:after="12pt"/>
+        <w:jc w:val="both"/>
+      </w:pPr>
+      <w:r>
+        <w:t xml:space="preserve">Social media has the potential to cause harm to the users, they can become addicted. Should it be illegal? There is a debate </w:t>
+      </w:r>
+      <w:proofErr w:type="gramStart"/>
+      <w:r>
+        <w:t>that is</w:t>
+      </w:r>
+      <w:proofErr w:type="gramEnd"/>
+      <w:r>
+        <w:t xml:space="preserve"> maybe it should be. The debate is strongest when it is considering if we should ban social media for minors, because adults have free will to cause themselves harm in general whereas minors don’t. Unlike drugs and gambling social media does have positives, it connects people which should not be understated. So, the solution of making it illegal for minors should be avoided. Even if a ban was put in place enforcing a ban would be almost impossible. A more responsible approach would be education. Just as there are mandatory education for drugs and alcohol in school so too should there be social media education along with other products that are purely incentivized to make addictive products.</w:t>
+      </w:r>
+    </w:p>
+    <w:p>
+      <w:pPr>
+        <w:pStyle w:val="Heading1"/>
+        <w:spacing w:after="12pt"/>
+        <w:jc w:val="both"/>
+      </w:pPr>
+      <w:r>
+        <w:t>Ethical analysis</w:t>
       </w:r>
     </w:p>
     <w:p>
@@ -510,85 +876,127 @@
         <w:pStyle w:val="Heading2"/>
       </w:pPr>
       <w:r>
-        <w:t xml:space="preserve">Selecting a </w:t>
-      </w:r>
-      <w:r>
-        <w:t>Template</w:t>
-      </w:r>
-      <w:r>
-        <w:t xml:space="preserve"> (Heading 2)</w:t>
-      </w:r>
-    </w:p>
-    <w:p>
-      <w:pPr>
-        <w:pStyle w:val="BodyText"/>
-      </w:pPr>
-      <w:r>
-        <w:t>First, confirm that you have the correct template for your paper size. This template has been tailored for output on the US-letter paper size. If you are using A4-sized paper, please close this</w:t>
-      </w:r>
-      <w:r>
-        <w:t xml:space="preserve"> file and download the file </w:t>
-      </w:r>
-      <w:r>
-        <w:t>“</w:t>
-      </w:r>
-      <w:r>
-        <w:t>MSW_A4_format</w:t>
-      </w:r>
-      <w:r>
-        <w:t>”.</w:t>
-      </w:r>
-    </w:p>
-    <w:p>
-      <w:pPr>
-        <w:pStyle w:val="BodyText"/>
-      </w:pPr>
+        <w:t>Kantiansim</w:t>
+      </w:r>
+    </w:p>
+    <w:p>
+      <w:pPr>
+        <w:spacing w:after="12pt"/>
+        <w:jc w:val="both"/>
+      </w:pPr>
+      <w:r>
+        <w:t xml:space="preserve">Under </w:t>
+      </w:r>
+      <w:r>
+        <w:t>Kantianism</w:t>
+      </w:r>
+      <w:r>
+        <w:t xml:space="preserve"> it is unethical to use people </w:t>
+      </w:r>
+      <w:proofErr w:type="gramStart"/>
+      <w:r>
+        <w:t>as a means to</w:t>
+      </w:r>
+      <w:proofErr w:type="gramEnd"/>
+      <w:r>
+        <w:t xml:space="preserve"> </w:t>
+      </w:r>
+      <w:proofErr w:type="spellStart"/>
+      <w:r>
+        <w:t>and</w:t>
+      </w:r>
+      <w:proofErr w:type="spellEnd"/>
+      <w:r>
+        <w:t xml:space="preserve"> end. Every company that wants their users to spend an infinite amount of time on their product is using their user </w:t>
+      </w:r>
+      <w:proofErr w:type="gramStart"/>
+      <w:r>
+        <w:t>as a means to</w:t>
+      </w:r>
+      <w:proofErr w:type="gramEnd"/>
+      <w:r>
+        <w:t xml:space="preserve"> an end. If you want to supply entertainment for your user you should be paid for this entertainment and you are using your customer or user </w:t>
+      </w:r>
+      <w:proofErr w:type="gramStart"/>
+      <w:r>
+        <w:t>as a means to</w:t>
+      </w:r>
+      <w:proofErr w:type="gramEnd"/>
+      <w:r>
+        <w:t xml:space="preserve"> an end, you want the customer to be entertained. If the product just wants the user to keep using the product and the result is to entertain the user that is using the customer </w:t>
+      </w:r>
+      <w:proofErr w:type="gramStart"/>
+      <w:r>
+        <w:t>as a means to</w:t>
+      </w:r>
+      <w:proofErr w:type="gramEnd"/>
+      <w:r>
+        <w:t xml:space="preserve"> earn money. Social media did not start </w:t>
+      </w:r>
+      <w:proofErr w:type="gramStart"/>
+      <w:r>
+        <w:t>as a means to</w:t>
+      </w:r>
+      <w:proofErr w:type="gramEnd"/>
+      <w:r>
+        <w:t xml:space="preserve"> collect data on users to sell to advertisers. It has become their business model though. Now social media companies care only if their users keep using their sites not if they are truly connecting people. This is evident by </w:t>
+      </w:r>
+      <w:proofErr w:type="gramStart"/>
+      <w:r>
+        <w:t>their the</w:t>
+      </w:r>
+      <w:proofErr w:type="gramEnd"/>
+      <w:r>
+        <w:t xml:space="preserve"> engagement algorithms they use. These algorithms prioritize engagement and outrage and polarization creates more </w:t>
+      </w:r>
+      <w:proofErr w:type="gramStart"/>
+      <w:r>
+        <w:t>engagement[</w:t>
+      </w:r>
+      <w:proofErr w:type="gramEnd"/>
+      <w:r>
+        <w:t>2</w:t>
+      </w:r>
+      <w:r>
+        <w:t>].</w:t>
+      </w:r>
     </w:p>
     <w:p>
       <w:pPr>
         <w:pStyle w:val="Heading2"/>
-      </w:pPr>
-      <w:r>
-        <w:t>Maintaining the Integrity of the Specifications</w:t>
-      </w:r>
-    </w:p>
-    <w:p>
-      <w:pPr>
-        <w:pStyle w:val="sponsors"/>
-        <w:framePr w:wrap="auto" w:vAnchor="page" w:hAnchor="page" w:x="43.40pt" w:y="720.05pt"/>
-        <w:ind w:firstLine="14.45pt"/>
-      </w:pPr>
-      <w:r>
-        <w:t>Identif</w:t>
-      </w:r>
-      <w:r>
-        <w:t xml:space="preserve">y applicable </w:t>
-      </w:r>
-      <w:r>
-        <w:t>funding agency</w:t>
-      </w:r>
-      <w:r>
-        <w:t xml:space="preserve"> here. </w:t>
-      </w:r>
-      <w:r>
-        <w:rPr>
-          <w:iCs/>
-        </w:rPr>
-        <w:t>If none, delete this text box</w:t>
-      </w:r>
-      <w:r>
-        <w:rPr>
-          <w:iCs/>
-        </w:rPr>
-        <w:t>.</w:t>
-      </w:r>
-    </w:p>
-    <w:p>
-      <w:pPr>
-        <w:pStyle w:val="BodyText"/>
-      </w:pPr>
-      <w:r>
-        <w:t>The template is used to format your paper and style the text. All margins, column widths, line spaces, and text fonts are prescribed; please do not alter them. You may note peculiarities. For example, the head margin in this template measures proportionately more than is customary. This measurement and others are deliberate, using specifications that anticipate your paper as one part of the entire proceedings, and not as an independent document. Please do not revise any of the current designations.</w:t>
+        <w:jc w:val="both"/>
+      </w:pPr>
+      <w:r>
+        <w:t>Rules Utilitarianism</w:t>
+      </w:r>
+    </w:p>
+    <w:p>
+      <w:pPr>
+        <w:spacing w:after="12pt"/>
+        <w:jc w:val="both"/>
+      </w:pPr>
+      <w:r>
+        <w:t>The rule for a rules Utilitarianism analysis will be, it is ethical for a company product to be only financially incentivized to keep their users engaged with their product for an infinite amount of time.</w:t>
+      </w:r>
+    </w:p>
+    <w:p>
+      <w:pPr>
+        <w:spacing w:after="12pt"/>
+        <w:jc w:val="both"/>
+      </w:pPr>
+      <w:r>
+        <w:t xml:space="preserve">With this rule in place this would let companies make products that are potentially infinitely addictive while still being ethical. The companies who own these products would probably make a lot of money, but this gain would not compensate for the suffering caused. When people are addicted to a product be it social media or an addictive drug, by the very definition of addiction they do is despite the harmful </w:t>
+      </w:r>
+      <w:proofErr w:type="gramStart"/>
+      <w:r>
+        <w:t>consequences[</w:t>
+      </w:r>
+      <w:proofErr w:type="gramEnd"/>
+      <w:r>
+        <w:t>1</w:t>
+      </w:r>
+      <w:r>
+        <w:t>]. The people addicted to these products would be causing themselves harm or other harm. This would far outweigh the happies gained by those who earned money from the company who own these addictive products.</w:t>
       </w:r>
     </w:p>
     <w:p>
@@ -596,1064 +1004,75 @@
         <w:pStyle w:val="Heading1"/>
       </w:pPr>
       <w:r>
-        <w:t xml:space="preserve">Prepare Your Paper </w:t>
-      </w:r>
-      <w:r>
-        <w:t>Before</w:t>
-      </w:r>
-      <w:r>
-        <w:t xml:space="preserve"> Styling</w:t>
-      </w:r>
-    </w:p>
-    <w:p>
-      <w:pPr>
-        <w:pStyle w:val="BodyText"/>
-        <w:rPr>
-          <w:lang w:val="en-US"/>
-        </w:rPr>
-      </w:pPr>
-      <w:r>
-        <w:t>Before</w:t>
-      </w:r>
-      <w:r>
-        <w:t xml:space="preserve"> you begin to format your paper, first write and save the content as a separate text file. </w:t>
-      </w:r>
-      <w:r>
-        <w:rPr>
-          <w:lang w:val="en-US"/>
-        </w:rPr>
-        <w:t>Complete all content and organizational editing before formatting. Please note sections A-D below for more information on proofreading, spelling and grammar.</w:t>
-      </w:r>
-    </w:p>
-    <w:p>
-      <w:pPr>
-        <w:pStyle w:val="BodyText"/>
-      </w:pPr>
-      <w:r>
-        <w:t>Keep your text and graphic files separate until after the text has been formatted and styled. Do not use hard tabs, and limit use of hard returns to only one return at the end of a paragraph. Do not add any kind of pagination anywhere in the paper. Do not number text heads-the template will do that for you.</w:t>
-      </w:r>
-    </w:p>
-    <w:p>
-      <w:pPr>
-        <w:pStyle w:val="Heading2"/>
-      </w:pPr>
-      <w:r>
-        <w:t>Abbreviations</w:t>
-      </w:r>
-      <w:r>
-        <w:t xml:space="preserve"> and Acronyms</w:t>
-      </w:r>
-    </w:p>
-    <w:p>
-      <w:pPr>
-        <w:pStyle w:val="BodyText"/>
-      </w:pPr>
-      <w:r>
-        <w:t xml:space="preserve">Define abbreviations and acronyms the first time they are used in the text, even after they have been defined in the abstract. Abbreviations such as IEEE, SI, MKS, CGS, </w:t>
-      </w:r>
-      <w:proofErr w:type="spellStart"/>
-      <w:r>
-        <w:t>sc</w:t>
-      </w:r>
-      <w:proofErr w:type="spellEnd"/>
-      <w:r>
-        <w:t>, dc, and rms do not have to be defined. Do not use abbreviations in the title or heads unless they are unavoidable.</w:t>
-      </w:r>
-    </w:p>
-    <w:p>
-      <w:pPr>
-        <w:pStyle w:val="Heading2"/>
-      </w:pPr>
-      <w:r>
-        <w:t>Units</w:t>
-      </w:r>
-    </w:p>
-    <w:p>
-      <w:pPr>
-        <w:pStyle w:val="bulletlist"/>
-      </w:pPr>
-      <w:r>
-        <w:t xml:space="preserve">Use </w:t>
-      </w:r>
-      <w:r>
-        <w:t>either</w:t>
-      </w:r>
-      <w:r>
-        <w:t xml:space="preserve"> SI (MKS) or CGS as primary units. (SI units are encouraged.) English units may be used as secondary units (in parentheses). An exception would be the use of English units as identifiers in trade, such as “3.5-inch disk drive”.</w:t>
-      </w:r>
-    </w:p>
-    <w:p>
-      <w:pPr>
-        <w:pStyle w:val="bulletlist"/>
-      </w:pPr>
-      <w:r>
-        <w:t xml:space="preserve">Avoid combining SI and CGS units, such as current in amperes and magnetic field in </w:t>
-      </w:r>
-      <w:proofErr w:type="spellStart"/>
-      <w:r>
-        <w:t>oersteds</w:t>
-      </w:r>
-      <w:proofErr w:type="spellEnd"/>
-      <w:r>
-        <w:t>. This often leads to confusion because equations do not balance dimensionally. If you must use mixed units, clearly state the units for each quantity that you use in an equation.</w:t>
-      </w:r>
-    </w:p>
-    <w:p>
-      <w:pPr>
-        <w:pStyle w:val="bulletlist"/>
-      </w:pPr>
-      <w:r>
-        <w:t>Do not mix complete spellings and abbreviations of units: “Wb/m2” or “</w:t>
-      </w:r>
-      <w:proofErr w:type="spellStart"/>
-      <w:r>
-        <w:t>webers</w:t>
-      </w:r>
-      <w:proofErr w:type="spellEnd"/>
-      <w:r>
-        <w:t xml:space="preserve"> per square meter”, not “</w:t>
-      </w:r>
-      <w:proofErr w:type="spellStart"/>
-      <w:r>
-        <w:t>webers</w:t>
-      </w:r>
-      <w:proofErr w:type="spellEnd"/>
-      <w:r>
-        <w:t xml:space="preserve">/m2”.  Spell out units when they appear in text: “. . . a few </w:t>
-      </w:r>
-      <w:proofErr w:type="spellStart"/>
-      <w:r>
-        <w:t>henries</w:t>
-      </w:r>
-      <w:proofErr w:type="spellEnd"/>
-      <w:r>
-        <w:t>”, not “. . . a few H”.</w:t>
-      </w:r>
-    </w:p>
-    <w:p>
-      <w:pPr>
-        <w:pStyle w:val="bulletlist"/>
-      </w:pPr>
-      <w:r>
-        <w:t xml:space="preserve">Use a zero before decimal points: “0.25”, not “.25”. Use “cm3”, not “cc”. </w:t>
-      </w:r>
-      <w:r>
-        <w:t>(</w:t>
-      </w:r>
-      <w:r>
-        <w:rPr>
-          <w:i/>
-          <w:iCs/>
-        </w:rPr>
-        <w:t>bullet list</w:t>
-      </w:r>
-      <w:r>
-        <w:t>)</w:t>
-      </w:r>
-    </w:p>
-    <w:p>
-      <w:pPr>
-        <w:pStyle w:val="Heading2"/>
-      </w:pPr>
-      <w:r>
-        <w:t>Equations</w:t>
-      </w:r>
-    </w:p>
-    <w:p>
-      <w:pPr>
-        <w:pStyle w:val="BodyText"/>
-      </w:pPr>
-      <w:r>
-        <w:t>The equations are an exception to the prescribed specifications of this template. You will need to determine whether or not your equation should be typed using either the Times New Roman or the Symbol font (please no other font). To create multileveled equations, it may be necessary to treat the equation as a graphic and insert it into the text after your paper is styled.</w:t>
-      </w:r>
-    </w:p>
-    <w:p>
-      <w:pPr>
-        <w:pStyle w:val="BodyText"/>
-        <w:rPr>
-          <w:lang w:val="en-US"/>
-        </w:rPr>
-      </w:pPr>
-      <w:r>
-        <w:t>Number equations consecutively. Equation numbers, within parentheses, are to position flush right, as in (1), using a right tab stop. To make your equations more compact, you may use the solidus ( / ), the exp function, or appropriate exponents. Italicize Roman symbols for quantities and variables, but not Greek symbols. Use a long dash rather than a hyphen for a minus sign. Punctuate equations with commas or periods when they are part of a sentence, as in</w:t>
-      </w:r>
-      <w:r>
-        <w:rPr>
-          <w:lang w:val="en-US"/>
-        </w:rPr>
-        <w:t>:</w:t>
-      </w:r>
-    </w:p>
-    <w:p>
-      <w:pPr>
-        <w:pStyle w:val="equation"/>
-        <w:rPr>
-          <w:rFonts w:hint="eastAsia"/>
-        </w:rPr>
-      </w:pPr>
-      <w:r>
-        <w:tab/>
-      </w:r>
-      <w:r>
-        <w:rPr>
-          <w:rFonts w:ascii="Times New Roman" w:hAnsi="Times New Roman" w:cs="Times New Roman"/>
-          <w:i/>
-        </w:rPr>
-        <w:t>a</w:t>
-      </w:r>
-      <w:r>
-        <w:t></w:t>
-      </w:r>
-      <w:r>
-        <w:t></w:t>
-      </w:r>
-      <w:r>
-        <w:t></w:t>
-      </w:r>
-      <w:r>
-        <w:rPr>
-          <w:rFonts w:ascii="Times New Roman" w:hAnsi="Times New Roman" w:cs="Times New Roman"/>
-          <w:i/>
-        </w:rPr>
-        <w:t>b</w:t>
-      </w:r>
-      <w:r>
-        <w:t></w:t>
-      </w:r>
-      <w:r>
-        <w:t></w:t>
-      </w:r>
-      <w:r>
-        <w:t></w:t>
-      </w:r>
-      <w:r>
-        <w:t></w:t>
-      </w:r>
-      <w:r>
-        <w:t></w:t>
-      </w:r>
-      <w:r>
-        <w:tab/>
-      </w:r>
-      <w:r>
-        <w:t></w:t>
-      </w:r>
-      <w:r>
-        <w:t></w:t>
-      </w:r>
-      <w:r>
-        <w:t></w:t>
-      </w:r>
-    </w:p>
-    <w:p>
-      <w:pPr>
-        <w:pStyle w:val="BodyText"/>
-      </w:pPr>
-      <w:r>
-        <w:t>Note that the equation is centered using a center tab stop. Be sure that the symbols in your equation have been defined before or immediately following the equation. Use “(1)”, not “Eq. (1)” or “equation (1)”, except at the beginning of a sentence: “Equation (1) is . . .”</w:t>
-      </w:r>
-    </w:p>
-    <w:p>
-      <w:pPr>
-        <w:pStyle w:val="Heading2"/>
-      </w:pPr>
-      <w:r>
-        <w:t>Some Common Mistakes</w:t>
-      </w:r>
-    </w:p>
-    <w:p>
-      <w:pPr>
-        <w:pStyle w:val="bulletlist"/>
-      </w:pPr>
-      <w:r>
-        <w:t>The word “data” is plural, not singular.</w:t>
-      </w:r>
-    </w:p>
-    <w:p>
-      <w:pPr>
-        <w:pStyle w:val="bulletlist"/>
-      </w:pPr>
-      <w:r>
-        <w:t xml:space="preserve">The subscript for the permeability of vacuum </w:t>
-      </w:r>
-      <w:r>
-        <w:rPr>
-          <w:rFonts w:ascii="Symbol" w:hAnsi="Symbol" w:cs="Symbol"/>
-          <w:i/>
-          <w:iCs/>
-          <w:snapToGrid w:val="0"/>
-        </w:rPr>
-        <w:t></w:t>
-      </w:r>
-      <w:r>
-        <w:rPr>
-          <w:vertAlign w:val="subscript"/>
-        </w:rPr>
-        <w:t>0</w:t>
-      </w:r>
-      <w:r>
-        <w:t>, and other common scientific constants, is zero with subscript formatting, not a lowercase letter “o”.</w:t>
-      </w:r>
-    </w:p>
-    <w:p>
-      <w:pPr>
-        <w:pStyle w:val="bulletlist"/>
-      </w:pPr>
-      <w:r>
-        <w:t xml:space="preserve">In American </w:t>
-      </w:r>
-      <w:r>
-        <w:t>English, commas, semi</w:t>
-      </w:r>
-      <w:r>
-        <w:t>colons, periods, question and exclamation marks are located within quotation marks only when a complete thought or name is cited, such as a title or full quotation. When quotation marks are used, instead of a bold or italic typeface, to highlight a word or phrase, punctuation should appear outside of the quotation marks. A parenthetical phrase or statement at the end of a sentence is punctuated outside of the closing parenthesis (like this). (A parenthetical sentence is punctuated within the parentheses.)</w:t>
-      </w:r>
-    </w:p>
-    <w:p>
-      <w:pPr>
-        <w:pStyle w:val="bulletlist"/>
-      </w:pPr>
-      <w:r>
-        <w:t>A graph within a graph is an “inset”, not an “insert”. The word alternatively is preferred to the word “alternately” (unless you really mean something that alternates).</w:t>
-      </w:r>
-    </w:p>
-    <w:p>
-      <w:pPr>
-        <w:pStyle w:val="bulletlist"/>
-      </w:pPr>
-      <w:r>
-        <w:t>Do not use the word “essentially” to mean “approximately” or “effectively”.</w:t>
-      </w:r>
-    </w:p>
-    <w:p>
-      <w:pPr>
-        <w:pStyle w:val="bulletlist"/>
-      </w:pPr>
-      <w:r>
-        <w:t>In your paper title, if the words “that uses” can accurately replace the word “using”, capitalize the “u”; if not, keep using lower-cased.</w:t>
-      </w:r>
-    </w:p>
-    <w:p>
-      <w:pPr>
-        <w:pStyle w:val="bulletlist"/>
-      </w:pPr>
-      <w:r>
-        <w:t>Be aware of the different meanings of the homophones “affect” and “effect”, “complement” and “compliment”, “discreet” and “discrete”, “principal” and “principle”.</w:t>
-      </w:r>
-    </w:p>
-    <w:p>
-      <w:pPr>
-        <w:pStyle w:val="bulletlist"/>
-      </w:pPr>
-      <w:r>
-        <w:t>Do not confuse “imply” and “infer”.</w:t>
-      </w:r>
-    </w:p>
-    <w:p>
-      <w:pPr>
-        <w:pStyle w:val="bulletlist"/>
-      </w:pPr>
-      <w:r>
-        <w:t>The prefix “non” is not a word; it should be joined to the word it modifies, usually without a hyphen.</w:t>
-      </w:r>
-    </w:p>
-    <w:p>
-      <w:pPr>
-        <w:pStyle w:val="bulletlist"/>
-      </w:pPr>
-      <w:r>
-        <w:t>There is no period after the “et” in the Latin abbreviation “et al.”.</w:t>
-      </w:r>
-    </w:p>
-    <w:p>
-      <w:pPr>
-        <w:pStyle w:val="bulletlist"/>
-      </w:pPr>
-      <w:r>
-        <w:t>The abbreviation “i.e.” means “that is”, and the abbreviation “e.g.” means “for example”.</w:t>
-      </w:r>
-    </w:p>
-    <w:p>
-      <w:pPr>
-        <w:pStyle w:val="BodyText"/>
-      </w:pPr>
-      <w:r>
-        <w:t>An excellent style manual for science writers is [7].</w:t>
-      </w:r>
-    </w:p>
-    <w:p>
-      <w:pPr>
-        <w:pStyle w:val="Heading1"/>
-      </w:pPr>
-      <w:r>
-        <w:t xml:space="preserve">Using the </w:t>
-      </w:r>
-      <w:r>
-        <w:t>Template</w:t>
-      </w:r>
-    </w:p>
-    <w:p>
-      <w:pPr>
-        <w:pStyle w:val="BodyText"/>
-      </w:pPr>
-      <w:r>
-        <w:t>After the text edit has been completed, the paper is ready for the template. Duplicate the template file by using the Save As command, and use the naming convention prescribed by your conference for the name of your paper. In this newly created file, highlight all of the contents and import your prepared text file. You are now ready to style your paper; use the scroll down window on the left of the MS Word Formatting toolbar.</w:t>
-      </w:r>
-    </w:p>
-    <w:p>
-      <w:pPr>
-        <w:pStyle w:val="Heading2"/>
-      </w:pPr>
-      <w:r>
-        <w:t>Authors</w:t>
-      </w:r>
-      <w:r>
-        <w:t xml:space="preserve"> and Affiliations</w:t>
-      </w:r>
-    </w:p>
-    <w:p>
-      <w:pPr>
-        <w:pStyle w:val="BodyText"/>
-      </w:pPr>
-      <w:r>
-        <w:rPr>
-          <w:b/>
-        </w:rPr>
-        <w:t xml:space="preserve">The template is </w:t>
-      </w:r>
-      <w:r>
-        <w:rPr>
-          <w:b/>
-        </w:rPr>
-        <w:t>designed</w:t>
-      </w:r>
-      <w:r>
-        <w:rPr>
-          <w:b/>
-          <w:lang w:val="en-US"/>
-        </w:rPr>
-        <w:t xml:space="preserve"> for,</w:t>
-      </w:r>
-      <w:r>
-        <w:rPr>
-          <w:b/>
-        </w:rPr>
-        <w:t xml:space="preserve"> but not limited to</w:t>
-      </w:r>
-      <w:r>
-        <w:rPr>
-          <w:b/>
-          <w:lang w:val="en-US"/>
-        </w:rPr>
-        <w:t>,</w:t>
-      </w:r>
-      <w:r>
-        <w:rPr>
-          <w:b/>
-          <w:lang w:val="en-US"/>
-        </w:rPr>
-        <w:t xml:space="preserve"> </w:t>
-      </w:r>
-      <w:r>
-        <w:rPr>
-          <w:b/>
-          <w:lang w:val="en-US"/>
-        </w:rPr>
-        <w:t>six</w:t>
-      </w:r>
-      <w:r>
-        <w:rPr>
-          <w:b/>
-          <w:lang w:val="en-US"/>
-        </w:rPr>
-        <w:t xml:space="preserve"> authors.</w:t>
-      </w:r>
-      <w:r>
-        <w:rPr>
-          <w:lang w:val="en-US"/>
-        </w:rPr>
-        <w:t xml:space="preserve"> </w:t>
-      </w:r>
-      <w:r>
-        <w:rPr>
-          <w:lang w:val="en-US"/>
-        </w:rPr>
-        <w:t xml:space="preserve">A minimum of one author is required for all conference articles. </w:t>
-      </w:r>
-      <w:r>
-        <w:t>Author names should be listed starting from left to right and then moving down to the next line. This is the author sequence that will be used in future citations and by indexing services.</w:t>
-      </w:r>
-      <w:r>
-        <w:t xml:space="preserve"> </w:t>
-      </w:r>
-      <w:r>
-        <w:t>Names should not be listed in columns nor group by affiliation.</w:t>
-      </w:r>
-      <w:r>
-        <w:rPr>
-          <w:lang w:val="en-US"/>
-        </w:rPr>
-        <w:t xml:space="preserve"> </w:t>
-      </w:r>
-      <w:r>
-        <w:t>Please keep your affiliations as succinct as possible (for example, do not differentiate among departments of the same organization).</w:t>
-      </w:r>
-    </w:p>
-    <w:p>
-      <w:pPr>
-        <w:pStyle w:val="Heading3"/>
-      </w:pPr>
-      <w:r>
-        <w:t xml:space="preserve">For papers with more than six authors: </w:t>
-      </w:r>
-      <w:r>
-        <w:rPr>
-          <w:i w:val="0"/>
-        </w:rPr>
-        <w:t>Add author names horizontally, moving to a third row if needed for more than 8 authors.</w:t>
-      </w:r>
-    </w:p>
-    <w:p>
-      <w:pPr>
-        <w:pStyle w:val="Heading3"/>
-      </w:pPr>
-      <w:r>
-        <w:t xml:space="preserve">For </w:t>
-      </w:r>
-      <w:r>
-        <w:t xml:space="preserve">papers with less than </w:t>
-      </w:r>
-      <w:r>
-        <w:t>six</w:t>
-      </w:r>
-      <w:r>
-        <w:t xml:space="preserve"> authors</w:t>
-      </w:r>
-      <w:r>
-        <w:t xml:space="preserve">: </w:t>
-      </w:r>
-      <w:r>
-        <w:rPr>
-          <w:i w:val="0"/>
-        </w:rPr>
-        <w:t>To change the default, adjust the template as follows.</w:t>
-      </w:r>
-    </w:p>
-    <w:p>
-      <w:pPr>
-        <w:pStyle w:val="Heading4"/>
-      </w:pPr>
-      <w:r>
-        <w:t>Selection</w:t>
-      </w:r>
-      <w:r>
-        <w:t xml:space="preserve">: </w:t>
-      </w:r>
-      <w:r>
-        <w:rPr>
-          <w:i w:val="0"/>
-        </w:rPr>
-        <w:t>Highlight all author and affiliation lines.</w:t>
-      </w:r>
-    </w:p>
-    <w:p>
-      <w:pPr>
-        <w:pStyle w:val="Heading4"/>
-      </w:pPr>
-      <w:r>
-        <w:t>Change number of columns:</w:t>
-      </w:r>
-      <w:r>
-        <w:t xml:space="preserve"> </w:t>
-      </w:r>
-      <w:r>
-        <w:rPr>
-          <w:i w:val="0"/>
-        </w:rPr>
-        <w:t xml:space="preserve">Select the Columns icon from the MS Word Standard toolbar and then select </w:t>
-      </w:r>
-      <w:r>
-        <w:rPr>
-          <w:i w:val="0"/>
-        </w:rPr>
-        <w:t>the correct number of columns</w:t>
-      </w:r>
-      <w:r>
-        <w:rPr>
-          <w:i w:val="0"/>
-        </w:rPr>
-        <w:t xml:space="preserve"> from the selection palette.</w:t>
-      </w:r>
-    </w:p>
-    <w:p>
-      <w:pPr>
-        <w:pStyle w:val="Heading4"/>
-        <w:rPr>
-          <w:i w:val="0"/>
-        </w:rPr>
-      </w:pPr>
-      <w:r>
-        <w:t xml:space="preserve">Deletion: </w:t>
-      </w:r>
-      <w:r>
-        <w:rPr>
-          <w:i w:val="0"/>
-        </w:rPr>
-        <w:t xml:space="preserve">Delete the author and affiliation lines for the </w:t>
-      </w:r>
-      <w:r>
-        <w:rPr>
-          <w:i w:val="0"/>
-        </w:rPr>
-        <w:t>extra authors.</w:t>
-      </w:r>
-    </w:p>
-    <w:p>
-      <w:pPr>
-        <w:jc w:val="start"/>
-        <w:rPr>
-          <w:i/>
-          <w:iCs/>
-          <w:noProof/>
-        </w:rPr>
-      </w:pPr>
-    </w:p>
-    <w:p>
-      <w:pPr>
-        <w:pStyle w:val="Heading2"/>
-      </w:pPr>
-      <w:r>
-        <w:t>Identify</w:t>
-      </w:r>
-      <w:r>
-        <w:t xml:space="preserve"> the Headings</w:t>
-      </w:r>
-    </w:p>
-    <w:p>
-      <w:pPr>
-        <w:pStyle w:val="BodyText"/>
-      </w:pPr>
-      <w:r>
-        <w:t>Headings, or heads, are organizational devices that guide the reader through your paper. There are two types: component heads and text heads.</w:t>
-      </w:r>
-    </w:p>
-    <w:p>
-      <w:pPr>
-        <w:pStyle w:val="BodyText"/>
-      </w:pPr>
-      <w:r>
-        <w:t>Component heads identify the different components of your paper and are not topically subordinate to each other. Examples include Acknowledgments and References and, for these, the correct style to use is “Heading 5”. Use “figure caption” for your Figure captions, and “table head” for your table title. Run-in heads, such as “Abstract”, will require you to apply a style (in this case, italic) in addition to the style provided by the drop down menu to differentiate the head from the text.</w:t>
-      </w:r>
-    </w:p>
-    <w:p>
-      <w:pPr>
-        <w:pStyle w:val="BodyText"/>
-      </w:pPr>
-      <w:r>
-        <w:t>Text heads organize the topics on a relational, hierarchical basis. For example, the paper title is the primary text head because all subsequent material relates and elaborates on this one topic. If there are two or more sub-topics, the next level head (uppercase Roman numerals) should be used and, conversely, if there are not at least two sub-topics, then no subheads should be introduced. Styles named “Heading 1”, “Heading 2”, “Heading 3”, and “Heading 4” are prescribed.</w:t>
-      </w:r>
-    </w:p>
-    <w:p>
-      <w:pPr>
-        <w:pStyle w:val="Heading2"/>
-      </w:pPr>
-      <w:r>
-        <w:t>Figures and Tables</w:t>
-      </w:r>
-    </w:p>
-    <w:p>
-      <w:pPr>
-        <w:pStyle w:val="Heading4"/>
-      </w:pPr>
-      <w:r>
-        <w:t xml:space="preserve"> </w:t>
-      </w:r>
-      <w:r>
-        <w:t xml:space="preserve">Positioning Figures and Tables: </w:t>
-      </w:r>
-      <w:r>
-        <w:rPr>
-          <w:i w:val="0"/>
-        </w:rPr>
-        <w:t>Place figures and tables at the top and bottom of columns. Avoid placing them in the middle of columns. Large figures and tables may span across both columns. Figure captions should be below the figures; table heads should appear above the tables. Insert figures and tables after they are cited in the text. Use the abbreviation “Fig. 1”, even at the beginning of a sentence.</w:t>
-      </w:r>
-    </w:p>
-    <w:p>
-      <w:pPr>
-        <w:pStyle w:val="tablehead"/>
-      </w:pPr>
-      <w:r>
-        <w:t>Table Type Styles</w:t>
-      </w:r>
-    </w:p>
-    <w:tbl>
-      <w:tblPr>
-        <w:tblW w:w="0pt" w:type="dxa"/>
-        <w:jc w:val="center"/>
-        <w:tblBorders>
-          <w:top w:val="single" w:sz="2" w:space="0" w:color="auto"/>
-          <w:start w:val="single" w:sz="2" w:space="0" w:color="auto"/>
-          <w:bottom w:val="single" w:sz="2" w:space="0" w:color="auto"/>
-          <w:end w:val="single" w:sz="2" w:space="0" w:color="auto"/>
-          <w:insideH w:val="single" w:sz="2" w:space="0" w:color="auto"/>
-          <w:insideV w:val="single" w:sz="2" w:space="0" w:color="auto"/>
-        </w:tblBorders>
-        <w:tblLayout w:type="fixed"/>
-        <w:tblLook w:firstRow="0" w:lastRow="0" w:firstColumn="0" w:lastColumn="0" w:noHBand="0" w:noVBand="0"/>
-      </w:tblPr>
-      <w:tblGrid>
-        <w:gridCol w:w="720"/>
-        <w:gridCol w:w="2340"/>
-        <w:gridCol w:w="900"/>
-        <w:gridCol w:w="900"/>
-      </w:tblGrid>
-      <w:tr>
-        <w:trPr>
-          <w:cantSplit/>
-          <w:trHeight w:val="240"/>
-          <w:tblHeader/>
-          <w:jc w:val="center"/>
-        </w:trPr>
-        <w:tc>
-          <w:tcPr>
-            <w:tcW w:w="36pt" w:type="dxa"/>
-            <w:vMerge w:val="restart"/>
-            <w:vAlign w:val="center"/>
-          </w:tcPr>
-          <w:p>
-            <w:pPr>
-              <w:pStyle w:val="tablecolhead"/>
-            </w:pPr>
-            <w:r>
-              <w:t>Table Head</w:t>
-            </w:r>
-          </w:p>
-        </w:tc>
-        <w:tc>
-          <w:tcPr>
-            <w:tcW w:w="207pt" w:type="dxa"/>
-            <w:gridSpan w:val="3"/>
-            <w:vAlign w:val="center"/>
-          </w:tcPr>
-          <w:p>
-            <w:pPr>
-              <w:pStyle w:val="tablecolhead"/>
-            </w:pPr>
-            <w:r>
-              <w:t>Table Column Head</w:t>
-            </w:r>
-          </w:p>
-        </w:tc>
-      </w:tr>
-      <w:tr>
-        <w:trPr>
-          <w:cantSplit/>
-          <w:trHeight w:val="240"/>
-          <w:tblHeader/>
-          <w:jc w:val="center"/>
-        </w:trPr>
-        <w:tc>
-          <w:tcPr>
-            <w:tcW w:w="36pt" w:type="dxa"/>
-            <w:vMerge/>
-          </w:tcPr>
-          <w:p>
-            <w:pPr>
-              <w:rPr>
-                <w:sz w:val="16"/>
-                <w:szCs w:val="16"/>
-              </w:rPr>
-            </w:pPr>
-          </w:p>
-        </w:tc>
-        <w:tc>
-          <w:tcPr>
-            <w:tcW w:w="117pt" w:type="dxa"/>
-            <w:vAlign w:val="center"/>
-          </w:tcPr>
-          <w:p>
-            <w:pPr>
-              <w:pStyle w:val="tablecolsubhead"/>
-            </w:pPr>
-            <w:r>
-              <w:t>Table column subhead</w:t>
-            </w:r>
-          </w:p>
-        </w:tc>
-        <w:tc>
-          <w:tcPr>
-            <w:tcW w:w="45pt" w:type="dxa"/>
-            <w:vAlign w:val="center"/>
-          </w:tcPr>
-          <w:p>
-            <w:pPr>
-              <w:pStyle w:val="tablecolsubhead"/>
-            </w:pPr>
-            <w:r>
-              <w:t>Subhead</w:t>
-            </w:r>
-          </w:p>
-        </w:tc>
-        <w:tc>
-          <w:tcPr>
-            <w:tcW w:w="45pt" w:type="dxa"/>
-            <w:vAlign w:val="center"/>
-          </w:tcPr>
-          <w:p>
-            <w:pPr>
-              <w:pStyle w:val="tablecolsubhead"/>
-            </w:pPr>
-            <w:r>
-              <w:t>Subhead</w:t>
-            </w:r>
-          </w:p>
-        </w:tc>
-      </w:tr>
-      <w:tr>
-        <w:trPr>
-          <w:trHeight w:val="320"/>
-          <w:jc w:val="center"/>
-        </w:trPr>
-        <w:tc>
-          <w:tcPr>
-            <w:tcW w:w="36pt" w:type="dxa"/>
-            <w:vAlign w:val="center"/>
-          </w:tcPr>
-          <w:p>
-            <w:pPr>
-              <w:pStyle w:val="tablecopy"/>
-              <w:rPr>
-                <w:sz w:val="8"/>
-                <w:szCs w:val="8"/>
-              </w:rPr>
-            </w:pPr>
-            <w:r>
-              <w:t>copy</w:t>
-            </w:r>
-          </w:p>
-        </w:tc>
-        <w:tc>
-          <w:tcPr>
-            <w:tcW w:w="117pt" w:type="dxa"/>
-            <w:vAlign w:val="center"/>
-          </w:tcPr>
-          <w:p>
-            <w:pPr>
-              <w:pStyle w:val="tablecopy"/>
-            </w:pPr>
-            <w:r>
-              <w:t>More table copy</w:t>
-            </w:r>
-            <w:r>
-              <w:rPr>
-                <w:vertAlign w:val="superscript"/>
-              </w:rPr>
-              <w:t>a</w:t>
-            </w:r>
-          </w:p>
-        </w:tc>
-        <w:tc>
-          <w:tcPr>
-            <w:tcW w:w="45pt" w:type="dxa"/>
-            <w:vAlign w:val="center"/>
-          </w:tcPr>
-          <w:p>
-            <w:pPr>
-              <w:rPr>
-                <w:sz w:val="16"/>
-                <w:szCs w:val="16"/>
-              </w:rPr>
-            </w:pPr>
-          </w:p>
-        </w:tc>
-        <w:tc>
-          <w:tcPr>
-            <w:tcW w:w="45pt" w:type="dxa"/>
-            <w:vAlign w:val="center"/>
-          </w:tcPr>
-          <w:p>
-            <w:pPr>
-              <w:rPr>
-                <w:sz w:val="16"/>
-                <w:szCs w:val="16"/>
-              </w:rPr>
-            </w:pPr>
-          </w:p>
-        </w:tc>
-      </w:tr>
-    </w:tbl>
-    <w:p>
-      <w:pPr>
-        <w:pStyle w:val="tablefootnote"/>
-      </w:pPr>
-      <w:r>
-        <w:rPr>
-          <w:noProof/>
-        </w:rPr>
-        <w:drawing>
-          <wp:anchor distT="0" distB="0" distL="114300" distR="114300" simplePos="0" relativeHeight="251657728" behindDoc="1" locked="0" layoutInCell="1" allowOverlap="1" wp14:anchorId="381BB491" wp14:editId="19EAE509">
-            <wp:simplePos x="0" y="0"/>
-            <wp:positionH relativeFrom="column">
-              <wp:align>right</wp:align>
-            </wp:positionH>
-            <wp:positionV relativeFrom="paragraph">
-              <wp:posOffset>134836</wp:posOffset>
-            </wp:positionV>
-            <wp:extent cx="3200400" cy="1143000"/>
-            <wp:effectExtent l="0" t="0" r="19050" b="19050"/>
-            <wp:wrapTight wrapText="bothSides">
-              <wp:wrapPolygon edited="0">
-                <wp:start x="0" y="0"/>
-                <wp:lineTo x="0" y="21600"/>
-                <wp:lineTo x="21600" y="21600"/>
-                <wp:lineTo x="21600" y="0"/>
-                <wp:lineTo x="0" y="0"/>
-              </wp:wrapPolygon>
-            </wp:wrapTight>
-            <wp:docPr id="1" name="Text Box 8"/>
-            <wp:cNvGraphicFramePr>
-              <a:graphicFrameLocks xmlns:a="http://purl.oclc.org/ooxml/drawingml/main"/>
-            </wp:cNvGraphicFramePr>
-            <a:graphic xmlns:a="http://purl.oclc.org/ooxml/drawingml/main">
-              <a:graphicData uri="http://schemas.microsoft.com/office/word/2010/wordprocessingShape">
-                <wp:wsp>
-                  <wp:cNvSpPr txBox="1">
-                    <a:spLocks noChangeArrowheads="1"/>
-                  </wp:cNvSpPr>
-                  <wp:spPr bwMode="auto">
-                    <a:xfrm>
-                      <a:off x="0" y="0"/>
-                      <a:ext cx="3200400" cy="1143000"/>
-                    </a:xfrm>
-                    <a:prstGeom prst="rect">
-                      <a:avLst/>
-                    </a:prstGeom>
-                    <a:solidFill>
-                      <a:srgbClr val="FFFFFF"/>
-                    </a:solidFill>
-                    <a:ln w="9525">
-                      <a:solidFill>
-                        <a:srgbClr val="000000"/>
-                      </a:solidFill>
-                      <a:miter lim="800%"/>
-                      <a:headEnd/>
-                      <a:tailEnd/>
-                    </a:ln>
-                  </wp:spPr>
-                  <wp:txbx>
-                    <wne:txbxContent>
-                      <w:p>
-                        <w:pPr>
-                          <w:pStyle w:val="BodyText"/>
-                        </w:pPr>
-                        <w:r>
-                          <w:t>We suggest that you use a text box to insert a graphic (which is ideally a 300 dpi TIFF or EPS file, with all fonts embedded) because, in an MSW document, this method is somewhat more stable than directly inserting a picture.</w:t>
-                        </w:r>
-                      </w:p>
-                      <w:p>
-                        <w:pPr>
-                          <w:pStyle w:val="BodyText"/>
-                        </w:pPr>
-                        <w:r>
-                          <w:t>To have non-visible rules on your frame, use the MSWord “Format” pull-down menu, select Text Box &gt; Colors and Lines to choose No Fill and No Line.</w:t>
-                        </w:r>
-                      </w:p>
-                    </wne:txbxContent>
-                  </wp:txbx>
-                  <wp:bodyPr rot="0" vert="horz" wrap="square" lIns="91440" tIns="45720" rIns="91440" bIns="45720" anchor="t" anchorCtr="0" upright="1">
-                    <a:noAutofit/>
-                  </wp:bodyPr>
-                </wp:wsp>
-              </a:graphicData>
-            </a:graphic>
-            <wp14:sizeRelH relativeFrom="page">
-              <wp14:pctWidth>0%</wp14:pctWidth>
-            </wp14:sizeRelH>
-            <wp14:sizeRelV relativeFrom="page">
-              <wp14:pctHeight>0%</wp14:pctHeight>
-            </wp14:sizeRelV>
-          </wp:anchor>
-        </w:drawing>
-      </w:r>
-      <w:r>
-        <w:t xml:space="preserve">Sample </w:t>
-      </w:r>
-      <w:r>
-        <w:t>of</w:t>
-      </w:r>
-      <w:r>
-        <w:t xml:space="preserve"> a </w:t>
-      </w:r>
-      <w:r>
-        <w:t>Table</w:t>
-      </w:r>
-      <w:r>
-        <w:t xml:space="preserve"> </w:t>
-      </w:r>
-      <w:r>
-        <w:t>footnote</w:t>
-      </w:r>
-      <w:r>
-        <w:t xml:space="preserve">. </w:t>
-      </w:r>
-      <w:r>
-        <w:t>(</w:t>
-      </w:r>
-      <w:r>
-        <w:rPr>
-          <w:i/>
-        </w:rPr>
-        <w:t>Table footnote</w:t>
-      </w:r>
-      <w:r>
-        <w:t>)</w:t>
-      </w:r>
-    </w:p>
-    <w:p>
-      <w:pPr>
-        <w:pStyle w:val="figurecaption"/>
-      </w:pPr>
-      <w:r>
-        <w:t xml:space="preserve">Example of a figure </w:t>
-      </w:r>
-      <w:r>
-        <w:t>caption</w:t>
-      </w:r>
-      <w:r>
-        <w:t xml:space="preserve">. </w:t>
-      </w:r>
-      <w:r>
-        <w:rPr>
-          <w:iCs/>
-        </w:rPr>
-        <w:t>(</w:t>
-      </w:r>
-      <w:r>
-        <w:rPr>
-          <w:i/>
-          <w:iCs/>
-        </w:rPr>
-        <w:t>figure caption</w:t>
-      </w:r>
-      <w:r>
-        <w:rPr>
-          <w:iCs/>
-        </w:rPr>
-        <w:t>)</w:t>
-      </w:r>
-    </w:p>
-    <w:p>
-      <w:pPr>
-        <w:pStyle w:val="BodyText"/>
-      </w:pPr>
-      <w:r>
-        <w:t>Figure Labels: Use 8 point Times New Roman for Figure labels. Use words rather than symbols or abbreviations when writing Figure axis labels to avoid confusing the reader. As an example, write the quantity “Magnetization”, or “Magnetization, M”, not just “M”. If including units in the label, present them within parentheses. Do not label axes only with units. In the example, write “Magnetization (A/m)” or “Magnetization {A[m(1)]}”, not just “A/m”. Do not label axes</w:t>
-      </w:r>
-      <w:r>
-        <w:t xml:space="preserve"> </w:t>
-      </w:r>
-      <w:r>
-        <w:t>with a ratio of quantities and units. For example, write “Temperature (K)”, not “Temperature/K”.</w:t>
+        <w:t>conclusion</w:t>
+      </w:r>
+    </w:p>
+    <w:p>
+      <w:pPr>
+        <w:spacing w:after="12pt"/>
+        <w:jc w:val="both"/>
+      </w:pPr>
+      <w:r>
+        <w:t xml:space="preserve">A product who only financial incentive is having its users use the product is unethical. These products are always incentivized to add addictive designs around or within their products. Purposely addicting your users is unethical because you treat your users </w:t>
+      </w:r>
+      <w:proofErr w:type="gramStart"/>
+      <w:r>
+        <w:t>as a means to</w:t>
+      </w:r>
+      <w:proofErr w:type="gramEnd"/>
+      <w:r>
+        <w:t xml:space="preserve"> an end and because addiction causes harm to the user and the people around them. </w:t>
+      </w:r>
+    </w:p>
+    <w:p>
+      <w:pPr>
+        <w:spacing w:after="12pt"/>
+        <w:jc w:val="both"/>
+      </w:pPr>
+      <w:r>
+        <w:t xml:space="preserve">Casinos are wholly incentivized to keep their customers gambling as long as </w:t>
+      </w:r>
+      <w:proofErr w:type="gramStart"/>
+      <w:r>
+        <w:t>possible</w:t>
+      </w:r>
+      <w:proofErr w:type="gramEnd"/>
+      <w:r>
+        <w:t xml:space="preserve"> making them unethical. Most governments around the world recognize this and gambling is highly regulated. Gambling can be considered entertaining even though it can be addicting, thus a consenting adult can </w:t>
+      </w:r>
+      <w:proofErr w:type="gramStart"/>
+      <w:r>
+        <w:t>gambling</w:t>
+      </w:r>
+      <w:proofErr w:type="gramEnd"/>
+      <w:r>
+        <w:t xml:space="preserve"> if they wish in lots of countries. </w:t>
+      </w:r>
+    </w:p>
+    <w:p>
+      <w:pPr>
+        <w:spacing w:after="12pt"/>
+        <w:jc w:val="both"/>
+      </w:pPr>
+      <w:r>
+        <w:t xml:space="preserve">Some video games are highly incentivized to add addictive design </w:t>
+      </w:r>
+      <w:proofErr w:type="gramStart"/>
+      <w:r>
+        <w:t>in order to</w:t>
+      </w:r>
+      <w:proofErr w:type="gramEnd"/>
+      <w:r>
+        <w:t xml:space="preserve"> sell microtransactions that are themselves addictive. These types of monetization models are unethical. If video games want to continue using addictive microtransactions they should be regulated as strongly as gambling by governments.</w:t>
+      </w:r>
+    </w:p>
+    <w:p>
+      <w:pPr>
+        <w:spacing w:after="12pt"/>
+        <w:jc w:val="both"/>
+      </w:pPr>
+      <w:r>
+        <w:t>Social media as products are mostly funded by data collected from users while the user is using the sites, so social media sites are unethical. This does not mean we should dismantle social media platforms. Social media has also brought a lot of good into the world through connecting countless people. Social media companies need to find other sources of revenue, so they are less incentivized to add addictive design or governments need to start treating social media differently. Examples of how to handle difficult products can be found in tobacco, alcohol and gambling. Education is the first and foremost solution. People need to be educated and warned of the dangers of addictive design in social media platforms.</w:t>
       </w:r>
     </w:p>
     <w:p>
@@ -1661,288 +1080,16 @@
         <w:pStyle w:val="Heading5"/>
       </w:pPr>
       <w:r>
-        <w:t>Acknowledgment</w:t>
-      </w:r>
-      <w:r>
-        <w:t xml:space="preserve"> </w:t>
-      </w:r>
-      <w:r>
-        <w:rPr>
-          <w:i/>
-          <w:iCs/>
-        </w:rPr>
-        <w:t>(</w:t>
-      </w:r>
-      <w:r>
-        <w:rPr>
-          <w:i/>
-          <w:iCs/>
-          <w:smallCaps w:val="0"/>
-        </w:rPr>
-        <w:t>Heading 5</w:t>
-      </w:r>
-      <w:r>
-        <w:rPr>
-          <w:i/>
-          <w:iCs/>
-        </w:rPr>
-        <w:t>)</w:t>
-      </w:r>
-    </w:p>
-    <w:p>
-      <w:pPr>
-        <w:pStyle w:val="BodyText"/>
-      </w:pPr>
-      <w:r>
-        <w:t>The preferred spelling of the word “acknowledgment” in America is without an “e” after the “g</w:t>
-      </w:r>
-      <w:r>
-        <w:t>”. Avoid the stilted expression “</w:t>
-      </w:r>
-      <w:r>
-        <w:rPr>
-          <w:lang w:val="en-US"/>
-        </w:rPr>
-        <w:t>o</w:t>
-      </w:r>
-      <w:r>
-        <w:t xml:space="preserve">ne of us (R. B. G.) thanks </w:t>
-      </w:r>
-      <w:r>
-        <w:t>...</w:t>
-      </w:r>
-      <w:r>
-        <w:rPr>
-          <w:lang w:val="en-US"/>
-        </w:rPr>
-        <w:t xml:space="preserve">”.  </w:t>
-      </w:r>
-      <w:r>
-        <w:t>Instead, try “R. B. G. thanks</w:t>
-      </w:r>
-      <w:r>
-        <w:t>...</w:t>
-      </w:r>
-      <w:r>
-        <w:t>”.</w:t>
-      </w:r>
-      <w:r>
-        <w:rPr>
-          <w:lang w:val="en-US"/>
-        </w:rPr>
-        <w:t xml:space="preserve"> </w:t>
-      </w:r>
-      <w:r>
-        <w:t>Put spons</w:t>
-      </w:r>
-      <w:r>
-        <w:t>or acknowledgments in the unnum</w:t>
-      </w:r>
-      <w:r>
-        <w:t>bered footnote on the first page.</w:t>
-      </w:r>
-      <w:r>
-        <w:t xml:space="preserve"> </w:t>
-      </w:r>
-    </w:p>
-    <w:p>
-      <w:pPr>
-        <w:pStyle w:val="Heading5"/>
-      </w:pPr>
-      <w:r>
         <w:t>References</w:t>
       </w:r>
     </w:p>
-    <w:p>
-      <w:pPr>
-        <w:pStyle w:val="BodyText"/>
-      </w:pPr>
-      <w:r>
-        <w:t>The template will number citations consecutively within brackets [1]. The sentence punctuation follows the bracket [2]. Refer simply to the reference number, as in [3]—do not use “Ref. [3]” or “reference [3]” except at the beginning of a sentence: “Reference [3] was the first</w:t>
-      </w:r>
-      <w:r>
-        <w:rPr>
-          <w:lang w:val="en-US"/>
-        </w:rPr>
-        <w:t xml:space="preserve"> </w:t>
-      </w:r>
-      <w:r>
-        <w:t>...</w:t>
-      </w:r>
-      <w:r>
-        <w:t>”</w:t>
-      </w:r>
-    </w:p>
-    <w:p>
-      <w:pPr>
-        <w:pStyle w:val="BodyText"/>
-      </w:pPr>
-      <w:r>
-        <w:t>Number footnotes separately in superscripts. Place the actual footnote at the bottom of the column in which it was cited. Do not put footnotes in the</w:t>
-      </w:r>
-      <w:r>
-        <w:rPr>
-          <w:lang w:val="en-US"/>
-        </w:rPr>
-        <w:t xml:space="preserve"> abstract or</w:t>
-      </w:r>
-      <w:r>
-        <w:t xml:space="preserve"> reference list. Use letters for table footnotes.</w:t>
-      </w:r>
-    </w:p>
-    <w:p>
-      <w:pPr>
-        <w:pStyle w:val="BodyText"/>
-      </w:pPr>
-      <w:r>
-        <w:t>Unless there are six au</w:t>
-      </w:r>
-      <w:r>
-        <w:t>thors or more give all authors</w:t>
-      </w:r>
-      <w:r>
-        <w:rPr>
-          <w:lang w:val="en-US"/>
-        </w:rPr>
-        <w:t xml:space="preserve">’ </w:t>
-      </w:r>
-      <w:r>
-        <w:t>names; do not use “et al.”. Papers that have not been published, even if they have been submitted for publication, should be cited as “unpublished” [4]. Papers that have been accepted for publication should be cited as “in press” [5]. Capitalize only the first word in a paper title, except for proper nouns and element symbols.</w:t>
-      </w:r>
-    </w:p>
-    <w:p>
-      <w:pPr>
-        <w:pStyle w:val="BodyText"/>
-      </w:pPr>
-      <w:r>
-        <w:t xml:space="preserve">For </w:t>
-      </w:r>
-      <w:r>
-        <w:t>papers</w:t>
-      </w:r>
-      <w:r>
-        <w:t xml:space="preserve"> published in translation journals, please give the English citation first, followed by the original foreign-language citation [6].</w:t>
-      </w:r>
-    </w:p>
     <w:p/>
     <w:p>
       <w:pPr>
         <w:pStyle w:val="references"/>
-        <w:ind w:start="17.70pt" w:hanging="17.70pt"/>
-      </w:pPr>
-      <w:r>
-        <w:t xml:space="preserve">G. Eason, B. Noble, and I. N. Sneddon, “On certain integrals of Lipschitz-Hankel type involving products of Bessel functions,” Phil. Trans. Roy. Soc. London, vol. A247, pp. 529–551, April 1955. </w:t>
-      </w:r>
-      <w:r>
-        <w:rPr>
-          <w:i/>
-          <w:iCs/>
-        </w:rPr>
-        <w:t>(references)</w:t>
-      </w:r>
-    </w:p>
-    <w:p>
-      <w:pPr>
-        <w:pStyle w:val="references"/>
-        <w:ind w:start="17.70pt" w:hanging="17.70pt"/>
-      </w:pPr>
-      <w:r>
-        <w:t>J. Clerk Maxwell, A Treatise on Electricity and Magnetism, 3rd ed., vol. 2. Oxford: Clarendon, 1892, pp.68–73.</w:t>
-      </w:r>
-    </w:p>
-    <w:p>
-      <w:pPr>
-        <w:pStyle w:val="references"/>
-        <w:ind w:start="17.70pt" w:hanging="17.70pt"/>
-      </w:pPr>
-      <w:r>
-        <w:t>I. S. Jacobs and C. P. Bean, “Fine particles, thin films and exchange anisotropy,” in Magnetism, vol. III, G. T. Rado and H. Suhl, Eds. New York: Academic, 1963, pp. 271–350.</w:t>
-      </w:r>
-    </w:p>
-    <w:p>
-      <w:pPr>
-        <w:pStyle w:val="references"/>
-        <w:ind w:start="17.70pt" w:hanging="17.70pt"/>
-      </w:pPr>
-      <w:r>
-        <w:t>K. Elissa, “Title of paper if known,” unpublished.</w:t>
-      </w:r>
-    </w:p>
-    <w:p>
-      <w:pPr>
-        <w:pStyle w:val="references"/>
-        <w:ind w:start="17.70pt" w:hanging="17.70pt"/>
-      </w:pPr>
-      <w:r>
-        <w:t>R. Nicole, “Title of paper with only first word capitalized,” J. Name Stand. Abbrev., in press.</w:t>
-      </w:r>
-    </w:p>
-    <w:p>
-      <w:pPr>
-        <w:pStyle w:val="references"/>
-        <w:ind w:start="17.70pt" w:hanging="17.70pt"/>
-      </w:pPr>
-      <w:r>
-        <w:t>Y. Yorozu, M. Hirano, K. Oka, and Y. Tagawa, “Electron spectroscopy studies on magneto-optical media and plastic substrate interface,” IEEE Transl. J. Magn. Japan, vol. 2, pp. 740–741, August 1987 [Digests 9th Annual Conf. Magnetics Japan, p. 301, 1982].</w:t>
-      </w:r>
-    </w:p>
-    <w:p>
-      <w:pPr>
-        <w:pStyle w:val="references"/>
-        <w:ind w:start="17.70pt" w:hanging="17.70pt"/>
-      </w:pPr>
-      <w:r>
-        <w:t>M. Young, The Technical Writer</w:t>
-      </w:r>
-      <w:r>
-        <w:t>’</w:t>
-      </w:r>
-      <w:r>
-        <w:t>s Handbook. Mill Valley, CA: University Science, 1989.</w:t>
-      </w:r>
-    </w:p>
-    <w:p>
-      <w:pPr>
-        <w:pStyle w:val="references"/>
-        <w:ind w:start="17.70pt" w:hanging="17.70pt"/>
-        <w:rPr>
-          <w:rFonts w:ascii="NimbusRomNo9L-Regu" w:eastAsia="NimbusRomNo9L-Regu" w:cs="NimbusRomNo9L-Regu"/>
-        </w:rPr>
-      </w:pPr>
-      <w:r>
-        <w:rPr>
-          <w:rFonts w:ascii="NimbusRomNo9L-Regu" w:eastAsia="NimbusRomNo9L-Regu" w:cs="NimbusRomNo9L-Regu"/>
-        </w:rPr>
-        <w:t xml:space="preserve"> </w:t>
-      </w:r>
-      <w:r>
-        <w:t xml:space="preserve">K. Eves and J. Valasek, </w:t>
-      </w:r>
-      <w:r>
-        <w:rPr>
-          <w:rFonts w:hint="eastAsia"/>
-        </w:rPr>
-        <w:t>“</w:t>
-      </w:r>
-      <w:r>
-        <w:t>Adaptive control for singularly perturbed systems examples,</w:t>
-      </w:r>
-      <w:r>
-        <w:rPr>
-          <w:rFonts w:hint="eastAsia"/>
-        </w:rPr>
-        <w:t>”</w:t>
-      </w:r>
-      <w:r>
-        <w:t xml:space="preserve"> Code Ocean, Aug. 2023. [Online]. Available: </w:t>
-      </w:r>
-      <w:hyperlink r:id="rId9" w:history="1">
-        <w:r>
-          <w:t>https://codeocean.com/capsule/4989235/tree</w:t>
-        </w:r>
-      </w:hyperlink>
-      <w:r>
-        <w:t xml:space="preserve"> </w:t>
+      </w:pPr>
+      <w:r>
+        <w:t xml:space="preserve">“What is the definition of addiction?,” Default, https://www.asam.org/quality-care/definition-of-addiction (accessed Aug. 1, 2024). </w:t>
       </w:r>
     </w:p>
     <w:p>
@@ -1955,122 +1102,95 @@
         <w:jc w:val="start"/>
       </w:pPr>
       <w:r>
-        <w:t xml:space="preserve">D. P. Kingma and M. Welling, </w:t>
-      </w:r>
-      <w:r>
-        <w:rPr>
-          <w:rFonts w:hint="eastAsia"/>
-        </w:rPr>
-        <w:t>“</w:t>
-      </w:r>
-      <w:r>
-        <w:t>Auto-encoding variational Bayes,</w:t>
-      </w:r>
-      <w:r>
-        <w:rPr>
-          <w:rFonts w:hint="eastAsia"/>
+        <w:t>C. L. Carpentier et al., “NEW ECONOMICS FOR SUSTAINABLE DEVELOPMENT,” ATTENTION ECONOMY, https://www.un.org/sites/un2.un.org/files/attention_economy_feb.pdf (accessed Aug. 1, 2024).</w:t>
+      </w:r>
+    </w:p>
+    <w:p>
+      <w:pPr>
+        <w:pStyle w:val="references"/>
+      </w:pPr>
+      <w:r>
+        <w:t>“Privacy statement,” Privacy Statement | Netflix Help Center, https://help.netflix.com/legal/privacy#cookies (accessed Aug. 1, 2024).</w:t>
+      </w:r>
+    </w:p>
+    <w:p>
+      <w:pPr>
+        <w:pStyle w:val="references"/>
+      </w:pPr>
+      <w:r>
+        <w:lastRenderedPageBreak/>
+        <w:t xml:space="preserve">J. A. MEERLOO, “Television addiction and reactive apathy,” </w:t>
+      </w:r>
+      <w:r>
+        <w:rPr>
+          <w:i/>
+          <w:iCs/>
+        </w:rPr>
+        <w:t>The Journal of Nervous and Mental Disease</w:t>
+      </w:r>
+      <w:r>
+        <w:t>, vol. 120, no. 3, pp. 290–291, Sep. 1954. doi:10.1097/00005053-195412030-00018</w:t>
+      </w:r>
+    </w:p>
+    <w:p>
+      <w:pPr>
+        <w:pStyle w:val="references"/>
+      </w:pPr>
+      <w:r>
+        <w:t>“Universal declaration of human rights,” United Nations, https://www.un.org/en/about-us/universal-declaration-of-human-rights (accessed Aug. 1, 2024).</w:t>
+      </w:r>
+    </w:p>
+    <w:p>
+      <w:pPr>
+        <w:pStyle w:val="references"/>
+      </w:pPr>
+      <w:r>
+        <w:t>“Switzerland</w:t>
+      </w:r>
+      <w:r>
+        <w:rPr>
+          <w:rFonts w:ascii="Arial" w:hAnsi="Arial" w:cs="Arial"/>
+        </w:rPr>
+        <w:t> </w:t>
+      </w:r>
+      <w:r>
+        <w:t>: Worrying changes in the practice of Assisted Suicide,</w:t>
+      </w:r>
+      <w:r>
+        <w:rPr>
+          <w:rFonts w:ascii="Aptos" w:hAnsi="Aptos" w:cs="Aptos"/>
         </w:rPr>
         <w:t>”</w:t>
       </w:r>
       <w:r>
-        <w:t xml:space="preserve"> 2013, arXiv:1312.6114. [Online]. Available: </w:t>
-      </w:r>
-      <w:hyperlink r:id="rId10" w:history="1">
-        <w:r>
-          <w:t>https://arxiv.org/abs/1312.6114</w:t>
-        </w:r>
-      </w:hyperlink>
+        <w:t xml:space="preserve"> Alliance VITA, https://www.alliancevita.org/en/2023/10/switzerland-worrying-changes-in-the-practice-of-assisted-suicide/ (accessed Aug. 1, 2024).</w:t>
+      </w:r>
     </w:p>
     <w:p>
       <w:pPr>
         <w:pStyle w:val="references"/>
-        <w:autoSpaceDE w:val="0"/>
-        <w:autoSpaceDN w:val="0"/>
-        <w:adjustRightInd w:val="0"/>
-        <w:ind w:start="17.70pt" w:hanging="17.70pt"/>
-        <w:jc w:val="start"/>
-      </w:pPr>
-      <w:r>
-        <w:t xml:space="preserve">S. Liu, </w:t>
-      </w:r>
-      <w:r>
-        <w:rPr>
-          <w:rFonts w:hint="eastAsia"/>
-        </w:rPr>
-        <w:t>“</w:t>
-      </w:r>
-      <w:r>
-        <w:t>Wi-Fi Energy Detection Testbed (12MTC),</w:t>
-      </w:r>
-      <w:r>
-        <w:rPr>
-          <w:rFonts w:hint="eastAsia"/>
-        </w:rPr>
-        <w:t>”</w:t>
-      </w:r>
-      <w:r>
-        <w:t xml:space="preserve"> 2023, gitHub repository. [Online]. Available: </w:t>
-      </w:r>
-      <w:r>
-        <w:t xml:space="preserve">https://github.com/liustone99/Wi-Fi-Energy-Detection-Testbed-12MTC </w:t>
+        <w:rPr>
+          <w:lang w:val="en-CA"/>
+        </w:rPr>
+      </w:pPr>
+      <w:r>
+        <w:rPr>
+          <w:lang w:val="en-CA"/>
+        </w:rPr>
+        <w:t xml:space="preserve">“Prohibition in Canada,” The Canadian Encyclopedia, https://www.thecanadianencyclopedia.ca/en/article/prohibition (accessed Aug. 2, 2024). </w:t>
       </w:r>
     </w:p>
     <w:p>
       <w:pPr>
         <w:pStyle w:val="references"/>
-        <w:autoSpaceDE w:val="0"/>
-        <w:autoSpaceDN w:val="0"/>
-        <w:adjustRightInd w:val="0"/>
-        <w:ind w:start="17.70pt" w:hanging="17.70pt"/>
-        <w:jc w:val="start"/>
-      </w:pPr>
-      <w:r>
-        <w:t>“</w:t>
-      </w:r>
-      <w:r>
-        <w:t>Treatment episode data set: discharges (TEDS-D): concatenated, 2006</w:t>
-      </w:r>
-      <w:r>
-        <w:t xml:space="preserve"> </w:t>
-      </w:r>
-      <w:r>
-        <w:t>to 2009.</w:t>
-      </w:r>
-      <w:r>
-        <w:rPr>
-          <w:rFonts w:hint="eastAsia"/>
-        </w:rPr>
-        <w:t>”</w:t>
-      </w:r>
-      <w:r>
-        <w:t xml:space="preserve"> U.S. Department of Health and Human Services, Substance</w:t>
-      </w:r>
-      <w:r>
-        <w:t xml:space="preserve"> </w:t>
-      </w:r>
-      <w:r>
-        <w:t>Abuse and Mental Health Services Administration, Office of Applied Studies, August, 2013, DOI:10.3886/ICPSR30122.v2</w:t>
+      </w:pPr>
+      <w:r>
+        <w:t>“Prohibition,” Encyclopædia Britannica, https://www.britannica.com/event/Prohibition-United-States-history-1920-1933 (accessed Aug. 2, 2024).</w:t>
       </w:r>
     </w:p>
     <w:p>
       <w:pPr>
         <w:pStyle w:val="references"/>
-        <w:numPr>
-          <w:ilvl w:val="0"/>
-          <w:numId w:val="0"/>
-        </w:numPr>
-        <w:ind w:start="18pt" w:hanging="18pt"/>
-        <w:jc w:val="center"/>
-        <w:rPr>
-          <w:rFonts w:eastAsia="SimSun"/>
-          <w:b/>
-          <w:noProof w:val="0"/>
-          <w:color w:val="FF0000"/>
-          <w:spacing w:val="-1"/>
-          <w:sz w:val="20"/>
-          <w:szCs w:val="20"/>
-          <w:lang w:val="x-none" w:eastAsia="x-none"/>
-        </w:rPr>
         <w:sectPr>
           <w:type w:val="continuous"/>
           <w:pgSz w:w="612pt" w:h="792pt" w:code="1"/>
@@ -2079,6 +1199,12 @@
           <w:docGrid w:linePitch="360"/>
         </w:sectPr>
       </w:pPr>
+      <w:r>
+        <w:rPr>
+          <w:lang w:val="en-CA"/>
+        </w:rPr>
+        <w:t>T. H. E. Team, “Frontal lobe: Functions, structure, damage, and more,” Healthline, https://www.healthline.com/human-body-maps/frontal-lobe (accessed Aug. 2, 2024).</w:t>
+      </w:r>
     </w:p>
     <w:p>
       <w:pPr>

</xml_diff>